<commit_message>
Sync manuscript with Zenodo DOI; ignore .git in offline verification
</commit_message>
<xml_diff>
--- a/deliverables/Tariff_Evidence_Audit_20261023.docx
+++ b/deliverables/Tariff_Evidence_Audit_20261023.docx
@@ -3700,7 +3700,7 @@
     </w:p>
     <w:p>
       <w:r>
-        <w:t>Data availability: The retained derived records, source locators, constructed inputs, reference erratum, prompts, raw model outputs and analysis code are provided in the reproducibility package accompanying the submission. Official public source snapshots are identified in the package manifest. Model weights are not redistributed and their official provenance and hashes are recorded.</w:t>
+        <w:t>Data availability: The retained derived records, source locators, constructed inputs, reference erratum, prompts, raw model outputs and analysis code are archived at Zenodo under version DOI 10.5281/zenodo.23641463, with concept DOI 10.5281/zenodo.23641462 for later versions. Official public source snapshots are included in that archive and identified in its manifest. Model weights are not redistributed, and their official provenance and hashes are recorded.</w:t>
       </w:r>
     </w:p>
     <w:p>
@@ -3710,7 +3710,7 @@
     </w:p>
     <w:p>
       <w:r>
-        <w:t>Code availability: Audit scripts, aggregation code, figure scripts and analysis code are included in the reproducibility package.</w:t>
+        <w:t>Code availability: Audit scripts, aggregation code, figure scripts and analysis code are included in the same Zenodo archive (10.5281/zenodo.23641463). The verification command recomputes the reported counts from the retained records and saved model replies.</w:t>
       </w:r>
     </w:p>
     <w:p>
@@ -3732,81 +3732,129 @@
       </w:r>
     </w:p>
     <w:p>
+      <w:pPr>
+        <w:spacing w:after="60" w:line="252" w:lineRule="auto"/>
+      </w:pPr>
       <w:r>
         <w:t>1. U.S. Trade Representative. Notice of product exclusions: China's acts, policies, and practices related to technology transfer, intellectual property, and innovation. Office of the U.S. Trade Representative (2018). https://ustr.gov/sites/default/files/enforcement/301Investigations/12.21.18_Notice_of_Product_Exclusions.pdf</w:t>
       </w:r>
     </w:p>
     <w:p>
+      <w:pPr>
+        <w:spacing w:after="60" w:line="252" w:lineRule="auto"/>
+      </w:pPr>
       <w:r>
         <w:t>2. U.S. Government Accountability Office. U.S.-China trade: USTR should fully document internal procedures for making tariff exclusion and extension decisions. GAO-21-506 (2021). https://www.gao.gov/products/gao-21-506</w:t>
       </w:r>
     </w:p>
     <w:p>
+      <w:pPr>
+        <w:spacing w:after="60" w:line="252" w:lineRule="auto"/>
+      </w:pPr>
       <w:r>
         <w:t>3. Koreeda, Y., Manning, C.D. ContractNLI: a dataset for document-level natural language inference for contracts. In: Findings of the Association for Computational Linguistics: EMNLP 2021, pp. 1907–1919. Association for Computational Linguistics (2021). https://doi.org/10.18653/v1/2021.findings-emnlp.164</w:t>
       </w:r>
     </w:p>
     <w:p>
+      <w:pPr>
+        <w:spacing w:after="60" w:line="252" w:lineRule="auto"/>
+      </w:pPr>
       <w:r>
         <w:t>4. Holzenberger, N., Van Durme, B. Connecting symbolic statutory reasoning with legal information extraction. In: Proceedings of the Natural Legal Language Processing Workshop 2023, pp. 113–131. Association for Computational Linguistics (2023). https://doi.org/10.18653/v1/2023.nllp-1.12</w:t>
       </w:r>
     </w:p>
     <w:p>
+      <w:pPr>
+        <w:spacing w:after="60" w:line="252" w:lineRule="auto"/>
+      </w:pPr>
       <w:r>
         <w:t>5. Medvedeva, M., McBride, P. Legal judgment prediction: if you are going to do it, do it right. In: Proceedings of the Natural Legal Language Processing Workshop 2023, pp. 73–84. Association for Computational Linguistics (2023). https://doi.org/10.18653/v1/2023.nllp-1.9</w:t>
       </w:r>
     </w:p>
     <w:p>
+      <w:pPr>
+        <w:spacing w:after="60" w:line="252" w:lineRule="auto"/>
+      </w:pPr>
       <w:r>
         <w:t>6. Gogani-Khiabani, S., Trivedi, A., Chyi, S.P., Tizpaz-Niari, S. Performance of LLMs on VITA test: potential for AI-assisted tax returns for low income taxpayers. Artificial Intelligence and Law (2025). https://doi.org/10.1007/s10506-025-09465-7</w:t>
       </w:r>
     </w:p>
     <w:p>
+      <w:pPr>
+        <w:spacing w:after="60" w:line="252" w:lineRule="auto"/>
+      </w:pPr>
       <w:r>
         <w:t>7. Roy Choudhury, M., Chandramouli, A., Anand, M., Gupta, V. Better Call CLAUSE: a discrepancy benchmark for auditing LLMs legal reasoning capabilities. In: Findings of the Association for Computational Linguistics: EACL 2026, pp. 5776–5818. Association for Computational Linguistics (2026). https://doi.org/10.18653/v1/2026.findings-eacl.305</w:t>
       </w:r>
     </w:p>
     <w:p>
+      <w:pPr>
+        <w:spacing w:after="60" w:line="252" w:lineRule="auto"/>
+      </w:pPr>
       <w:r>
         <w:t>8. Ribeiro, M.T., Wu, T., Guestrin, C., Singh, S. Beyond accuracy: behavioral testing of NLP models with CheckList. In: Proceedings of the 58th Annual Meeting of the Association for Computational Linguistics, pp. 4902–4912. Association for Computational Linguistics (2020). https://doi.org/10.18653/v1/2020.acl-main.442</w:t>
       </w:r>
     </w:p>
     <w:p>
+      <w:pPr>
+        <w:spacing w:after="60" w:line="252" w:lineRule="auto"/>
+      </w:pPr>
       <w:r>
         <w:t>9. Lee, E., Kim, S., Kim, S., Jung, S., Kim, H., Cha, M. Explainable product classification for customs. ACM Transactions on Intelligent Systems and Technology 15(2), Article 25, 1–24 (2024). https://doi.org/10.1145/3635158</w:t>
       </w:r>
     </w:p>
     <w:p>
+      <w:pPr>
+        <w:spacing w:after="60" w:line="252" w:lineRule="auto"/>
+      </w:pPr>
       <w:r>
         <w:t>10. Lan, T., Yang, Y., Jia, Q., Zhu, L., Jiang, H., Zhu, H., Luo, W., Wang, L. HSCodeComp: a realistic and expert-level agent benchmark for hierarchical rule application. In: Proceedings of the 64th Annual Meeting of the Association for Computational Linguistics, Volume 1: Long Papers, pp. 20458–20489. Association for Computational Linguistics (2026). https://doi.org/10.18653/v1/2026.acl-long.937</w:t>
       </w:r>
     </w:p>
     <w:p>
+      <w:pPr>
+        <w:spacing w:after="60" w:line="252" w:lineRule="auto"/>
+      </w:pPr>
       <w:r>
         <w:t>11. Xia, Q., Zhang, Z., Wang, A., Wang, W., Wang, X., Li, J. HSGraphAgent: knowledge-graph-guided large language models for Harmonized System code classification. In: Proceedings of the 64th Annual Meeting of the Association for Computational Linguistics, Volume 1: Long Papers, pp. 44761–44773. Association for Computational Linguistics (2026). https://doi.org/10.18653/v1/2026.acl-long.2072</w:t>
       </w:r>
     </w:p>
     <w:p>
+      <w:pPr>
+        <w:spacing w:after="60" w:line="252" w:lineRule="auto"/>
+      </w:pPr>
       <w:r>
         <w:t>12. Lee, H., Choi, G., Lee, E.-J., Lee, S.-M., Ko, Y., Lim, D., Jang, S.-K., Jo, Y. TriBench-Ko: evaluating LLM risks in judicial workflows. arXiv 2605.03792 (2026) [preprint]. https://doi.org/10.48550/arXiv.2605.03792</w:t>
       </w:r>
     </w:p>
     <w:p>
+      <w:pPr>
+        <w:spacing w:after="60" w:line="252" w:lineRule="auto"/>
+      </w:pPr>
       <w:r>
         <w:t>13. U.S. Customs and Border Protection. Customs Rulings Online Search System (CROSS), public database (n.d.). https://rulings.cbp.gov/</w:t>
       </w:r>
     </w:p>
     <w:p>
+      <w:pPr>
+        <w:spacing w:after="60" w:line="252" w:lineRule="auto"/>
+      </w:pPr>
       <w:r>
         <w:t>14. U.S. Trade Representative. Index of exclusions for possible extension, 17 January 2024 version (2024). https://ustr.gov/sites/default/files/Updated%20Index%20of%20Exclusions%20for%20Extension%201.17.24.pdf</w:t>
       </w:r>
     </w:p>
     <w:p>
+      <w:pPr>
+        <w:spacing w:after="60" w:line="252" w:lineRule="auto"/>
+      </w:pPr>
       <w:r>
         <w:t>15. Qwen Team. Qwen3-14B, model card and weights (2025). https://huggingface.co/Qwen/Qwen3-14B</w:t>
       </w:r>
     </w:p>
     <w:p>
+      <w:pPr>
+        <w:spacing w:after="60" w:line="252" w:lineRule="auto"/>
+      </w:pPr>
       <w:r>
         <w:t>16. ggml-org. llama.cpp, build b11516 (2026). https://github.com/ggml-org/llama.cpp/releases/tag/b11516</w:t>
       </w:r>

</xml_diff>

<commit_message>
Data availability cites a single Zenodo DOI
</commit_message>
<xml_diff>
--- a/deliverables/Tariff_Evidence_Audit_20261023.docx
+++ b/deliverables/Tariff_Evidence_Audit_20261023.docx
@@ -3700,7 +3700,7 @@
     </w:p>
     <w:p>
       <w:r>
-        <w:t>Data availability: The retained derived records, source locators, constructed inputs, reference erratum, prompts, raw model outputs and analysis code are archived at Zenodo under version DOI 10.5281/zenodo.23641463, with concept DOI 10.5281/zenodo.23641462 for later versions. Official public source snapshots are included in that archive and identified in its manifest. Model weights are not redistributed, and their official provenance and hashes are recorded.</w:t>
+        <w:t>Data availability: The retained derived records, source locators, constructed inputs, reference erratum, prompts, raw model outputs and analysis code are archived at Zenodo: https://doi.org/10.5281/zenodo.23641463. Official public source snapshots are included in that archive and identified in its manifest. Model weights are not redistributed, and their official provenance and hashes are recorded.</w:t>
       </w:r>
     </w:p>
     <w:p>
@@ -3710,7 +3710,7 @@
     </w:p>
     <w:p>
       <w:r>
-        <w:t>Code availability: Audit scripts, aggregation code, figure scripts and analysis code are included in the same Zenodo archive (10.5281/zenodo.23641463). The verification command recomputes the reported counts from the retained records and saved model replies.</w:t>
+        <w:t>Code availability: Audit scripts, aggregation code, figure scripts and analysis code are included in the same Zenodo archive. The verification command recomputes the reported counts from the retained records and saved model replies.</w:t>
       </w:r>
     </w:p>
     <w:p>

</xml_diff>